<commit_message>
docs: add pages template and api bug reports
</commit_message>
<xml_diff>
--- a/documents/Отчет по СПО (проект 2).docx
+++ b/documents/Отчет по СПО (проект 2).docx
@@ -5344,7 +5344,19 @@
         <w:rPr>
           <w:lang w:val="en-US"/>
         </w:rPr>
-        <w:instrText xml:space="preserve"> LINK Excel.Sheet.12 "C:\\Users\\kseni\\Downloads\\University\\Software_development_5_sem\\Goblincore\\documents\\СПО_Goblincore_Список_API.xlsx" "Лист1!R3C6:R23C13" \a \f 5 \h  \* MERGEFORMAT </w:instrText>
+        <w:instrText xml:space="preserve"> LINK </w:instrText>
+      </w:r>
+      <w:r>
+        <w:rPr>
+          <w:lang w:val="en-US"/>
+        </w:rPr>
+        <w:instrText xml:space="preserve">Excel.Sheet.12 C:\\Users\\kseni\\Downloads\\University\\Software_development_5_sem\\Goblincore\\documents\\СПО_Goblincore_Список_API.xlsx Лист1!R3C6:R23C13 </w:instrText>
+      </w:r>
+      <w:r>
+        <w:rPr>
+          <w:lang w:val="en-US"/>
+        </w:rPr>
+        <w:instrText xml:space="preserve">\a \f 5 \h  \* MERGEFORMAT </w:instrText>
       </w:r>
       <w:r>
         <w:rPr>
@@ -8870,7 +8882,443 @@
         <w:t>:</w:t>
       </w:r>
     </w:p>
-    <w:p/>
+    <w:p>
+      <w:r>
+        <w:t>Страница регистрации:</w:t>
+      </w:r>
+    </w:p>
+    <w:p>
+      <w:pPr>
+        <w:pStyle w:val="a6"/>
+      </w:pPr>
+      <w:r>
+        <w:rPr>
+          <w:noProof/>
+        </w:rPr>
+        <w:lastRenderedPageBreak/>
+        <w:drawing>
+          <wp:inline distT="0" distB="0" distL="0" distR="0" wp14:anchorId="37E8B276" wp14:editId="0BE46321">
+            <wp:extent cx="6120130" cy="5845810"/>
+            <wp:effectExtent l="0" t="0" r="0" b="2540"/>
+            <wp:docPr id="677852130" name="Рисунок 1"/>
+            <wp:cNvGraphicFramePr>
+              <a:graphicFrameLocks xmlns:a="http://schemas.openxmlformats.org/drawingml/2006/main" noChangeAspect="1"/>
+            </wp:cNvGraphicFramePr>
+            <a:graphic xmlns:a="http://schemas.openxmlformats.org/drawingml/2006/main">
+              <a:graphicData uri="http://schemas.openxmlformats.org/drawingml/2006/picture">
+                <pic:pic xmlns:pic="http://schemas.openxmlformats.org/drawingml/2006/picture">
+                  <pic:nvPicPr>
+                    <pic:cNvPr id="677852130" name="Рисунок 677852130"/>
+                    <pic:cNvPicPr/>
+                  </pic:nvPicPr>
+                  <pic:blipFill>
+                    <a:blip r:embed="rId9">
+                      <a:extLst>
+                        <a:ext uri="{28A0092B-C50C-407E-A947-70E740481C1C}">
+                          <a14:useLocalDpi xmlns:a14="http://schemas.microsoft.com/office/drawing/2010/main" val="0"/>
+                        </a:ext>
+                      </a:extLst>
+                    </a:blip>
+                    <a:stretch>
+                      <a:fillRect/>
+                    </a:stretch>
+                  </pic:blipFill>
+                  <pic:spPr>
+                    <a:xfrm>
+                      <a:off x="0" y="0"/>
+                      <a:ext cx="6120130" cy="5845810"/>
+                    </a:xfrm>
+                    <a:prstGeom prst="rect">
+                      <a:avLst/>
+                    </a:prstGeom>
+                  </pic:spPr>
+                </pic:pic>
+              </a:graphicData>
+            </a:graphic>
+          </wp:inline>
+        </w:drawing>
+      </w:r>
+    </w:p>
+    <w:p>
+      <w:r>
+        <w:t>Страницы со списками доходов и расходов:</w:t>
+      </w:r>
+    </w:p>
+    <w:p>
+      <w:pPr>
+        <w:pStyle w:val="a6"/>
+      </w:pPr>
+      <w:r>
+        <w:rPr>
+          <w:noProof/>
+        </w:rPr>
+        <w:lastRenderedPageBreak/>
+        <w:drawing>
+          <wp:inline distT="0" distB="0" distL="0" distR="0" wp14:anchorId="1C13013E" wp14:editId="486927F1">
+            <wp:extent cx="6120130" cy="2832735"/>
+            <wp:effectExtent l="0" t="0" r="0" b="5715"/>
+            <wp:docPr id="1909926982" name="Рисунок 2"/>
+            <wp:cNvGraphicFramePr>
+              <a:graphicFrameLocks xmlns:a="http://schemas.openxmlformats.org/drawingml/2006/main" noChangeAspect="1"/>
+            </wp:cNvGraphicFramePr>
+            <a:graphic xmlns:a="http://schemas.openxmlformats.org/drawingml/2006/main">
+              <a:graphicData uri="http://schemas.openxmlformats.org/drawingml/2006/picture">
+                <pic:pic xmlns:pic="http://schemas.openxmlformats.org/drawingml/2006/picture">
+                  <pic:nvPicPr>
+                    <pic:cNvPr id="1909926982" name="Рисунок 1909926982"/>
+                    <pic:cNvPicPr/>
+                  </pic:nvPicPr>
+                  <pic:blipFill>
+                    <a:blip r:embed="rId10" cstate="print">
+                      <a:extLst>
+                        <a:ext uri="{28A0092B-C50C-407E-A947-70E740481C1C}">
+                          <a14:useLocalDpi xmlns:a14="http://schemas.microsoft.com/office/drawing/2010/main" val="0"/>
+                        </a:ext>
+                      </a:extLst>
+                    </a:blip>
+                    <a:stretch>
+                      <a:fillRect/>
+                    </a:stretch>
+                  </pic:blipFill>
+                  <pic:spPr>
+                    <a:xfrm>
+                      <a:off x="0" y="0"/>
+                      <a:ext cx="6120130" cy="2832735"/>
+                    </a:xfrm>
+                    <a:prstGeom prst="rect">
+                      <a:avLst/>
+                    </a:prstGeom>
+                  </pic:spPr>
+                </pic:pic>
+              </a:graphicData>
+            </a:graphic>
+          </wp:inline>
+        </w:drawing>
+      </w:r>
+    </w:p>
+    <w:p>
+      <w:pPr>
+        <w:pStyle w:val="a6"/>
+      </w:pPr>
+      <w:r>
+        <w:rPr>
+          <w:noProof/>
+        </w:rPr>
+        <w:drawing>
+          <wp:inline distT="0" distB="0" distL="0" distR="0" wp14:anchorId="432EEFCD" wp14:editId="434BA797">
+            <wp:extent cx="6120130" cy="3556635"/>
+            <wp:effectExtent l="0" t="0" r="0" b="5715"/>
+            <wp:docPr id="619732501" name="Рисунок 3"/>
+            <wp:cNvGraphicFramePr>
+              <a:graphicFrameLocks xmlns:a="http://schemas.openxmlformats.org/drawingml/2006/main" noChangeAspect="1"/>
+            </wp:cNvGraphicFramePr>
+            <a:graphic xmlns:a="http://schemas.openxmlformats.org/drawingml/2006/main">
+              <a:graphicData uri="http://schemas.openxmlformats.org/drawingml/2006/picture">
+                <pic:pic xmlns:pic="http://schemas.openxmlformats.org/drawingml/2006/picture">
+                  <pic:nvPicPr>
+                    <pic:cNvPr id="619732501" name="Рисунок 619732501"/>
+                    <pic:cNvPicPr/>
+                  </pic:nvPicPr>
+                  <pic:blipFill>
+                    <a:blip r:embed="rId11" cstate="print">
+                      <a:extLst>
+                        <a:ext uri="{28A0092B-C50C-407E-A947-70E740481C1C}">
+                          <a14:useLocalDpi xmlns:a14="http://schemas.microsoft.com/office/drawing/2010/main" val="0"/>
+                        </a:ext>
+                      </a:extLst>
+                    </a:blip>
+                    <a:stretch>
+                      <a:fillRect/>
+                    </a:stretch>
+                  </pic:blipFill>
+                  <pic:spPr>
+                    <a:xfrm>
+                      <a:off x="0" y="0"/>
+                      <a:ext cx="6120130" cy="3556635"/>
+                    </a:xfrm>
+                    <a:prstGeom prst="rect">
+                      <a:avLst/>
+                    </a:prstGeom>
+                  </pic:spPr>
+                </pic:pic>
+              </a:graphicData>
+            </a:graphic>
+          </wp:inline>
+        </w:drawing>
+      </w:r>
+    </w:p>
+    <w:p>
+      <w:pPr>
+        <w:pStyle w:val="a6"/>
+      </w:pPr>
+      <w:r>
+        <w:rPr>
+          <w:noProof/>
+        </w:rPr>
+        <w:drawing>
+          <wp:inline distT="0" distB="0" distL="0" distR="0" wp14:anchorId="3F0E803D" wp14:editId="693F7A81">
+            <wp:extent cx="6120130" cy="1485900"/>
+            <wp:effectExtent l="0" t="0" r="0" b="0"/>
+            <wp:docPr id="1894483415" name="Рисунок 4"/>
+            <wp:cNvGraphicFramePr>
+              <a:graphicFrameLocks xmlns:a="http://schemas.openxmlformats.org/drawingml/2006/main" noChangeAspect="1"/>
+            </wp:cNvGraphicFramePr>
+            <a:graphic xmlns:a="http://schemas.openxmlformats.org/drawingml/2006/main">
+              <a:graphicData uri="http://schemas.openxmlformats.org/drawingml/2006/picture">
+                <pic:pic xmlns:pic="http://schemas.openxmlformats.org/drawingml/2006/picture">
+                  <pic:nvPicPr>
+                    <pic:cNvPr id="1894483415" name="Рисунок 1894483415"/>
+                    <pic:cNvPicPr/>
+                  </pic:nvPicPr>
+                  <pic:blipFill>
+                    <a:blip r:embed="rId12" cstate="print">
+                      <a:extLst>
+                        <a:ext uri="{28A0092B-C50C-407E-A947-70E740481C1C}">
+                          <a14:useLocalDpi xmlns:a14="http://schemas.microsoft.com/office/drawing/2010/main" val="0"/>
+                        </a:ext>
+                      </a:extLst>
+                    </a:blip>
+                    <a:stretch>
+                      <a:fillRect/>
+                    </a:stretch>
+                  </pic:blipFill>
+                  <pic:spPr>
+                    <a:xfrm>
+                      <a:off x="0" y="0"/>
+                      <a:ext cx="6120130" cy="1485900"/>
+                    </a:xfrm>
+                    <a:prstGeom prst="rect">
+                      <a:avLst/>
+                    </a:prstGeom>
+                  </pic:spPr>
+                </pic:pic>
+              </a:graphicData>
+            </a:graphic>
+          </wp:inline>
+        </w:drawing>
+      </w:r>
+    </w:p>
+    <w:p>
+      <w:r>
+        <w:t>Страницы с категориями доходов и расходов:</w:t>
+      </w:r>
+    </w:p>
+    <w:p>
+      <w:pPr>
+        <w:pStyle w:val="a6"/>
+      </w:pPr>
+      <w:r>
+        <w:rPr>
+          <w:noProof/>
+        </w:rPr>
+        <w:lastRenderedPageBreak/>
+        <w:drawing>
+          <wp:inline distT="0" distB="0" distL="0" distR="0" wp14:anchorId="5210D9CA" wp14:editId="21738EF1">
+            <wp:extent cx="6120130" cy="2541905"/>
+            <wp:effectExtent l="0" t="0" r="0" b="0"/>
+            <wp:docPr id="1540790526" name="Рисунок 5"/>
+            <wp:cNvGraphicFramePr>
+              <a:graphicFrameLocks xmlns:a="http://schemas.openxmlformats.org/drawingml/2006/main" noChangeAspect="1"/>
+            </wp:cNvGraphicFramePr>
+            <a:graphic xmlns:a="http://schemas.openxmlformats.org/drawingml/2006/main">
+              <a:graphicData uri="http://schemas.openxmlformats.org/drawingml/2006/picture">
+                <pic:pic xmlns:pic="http://schemas.openxmlformats.org/drawingml/2006/picture">
+                  <pic:nvPicPr>
+                    <pic:cNvPr id="1540790526" name="Рисунок 1540790526"/>
+                    <pic:cNvPicPr/>
+                  </pic:nvPicPr>
+                  <pic:blipFill>
+                    <a:blip r:embed="rId13" cstate="print">
+                      <a:extLst>
+                        <a:ext uri="{28A0092B-C50C-407E-A947-70E740481C1C}">
+                          <a14:useLocalDpi xmlns:a14="http://schemas.microsoft.com/office/drawing/2010/main" val="0"/>
+                        </a:ext>
+                      </a:extLst>
+                    </a:blip>
+                    <a:stretch>
+                      <a:fillRect/>
+                    </a:stretch>
+                  </pic:blipFill>
+                  <pic:spPr>
+                    <a:xfrm>
+                      <a:off x="0" y="0"/>
+                      <a:ext cx="6120130" cy="2541905"/>
+                    </a:xfrm>
+                    <a:prstGeom prst="rect">
+                      <a:avLst/>
+                    </a:prstGeom>
+                  </pic:spPr>
+                </pic:pic>
+              </a:graphicData>
+            </a:graphic>
+          </wp:inline>
+        </w:drawing>
+      </w:r>
+    </w:p>
+    <w:p>
+      <w:pPr>
+        <w:pStyle w:val="a6"/>
+      </w:pPr>
+      <w:r>
+        <w:rPr>
+          <w:noProof/>
+        </w:rPr>
+        <w:drawing>
+          <wp:inline distT="0" distB="0" distL="0" distR="0" wp14:anchorId="781AF619" wp14:editId="79BB4C85">
+            <wp:extent cx="6120130" cy="1805940"/>
+            <wp:effectExtent l="0" t="0" r="0" b="3810"/>
+            <wp:docPr id="1989431065" name="Рисунок 6"/>
+            <wp:cNvGraphicFramePr>
+              <a:graphicFrameLocks xmlns:a="http://schemas.openxmlformats.org/drawingml/2006/main" noChangeAspect="1"/>
+            </wp:cNvGraphicFramePr>
+            <a:graphic xmlns:a="http://schemas.openxmlformats.org/drawingml/2006/main">
+              <a:graphicData uri="http://schemas.openxmlformats.org/drawingml/2006/picture">
+                <pic:pic xmlns:pic="http://schemas.openxmlformats.org/drawingml/2006/picture">
+                  <pic:nvPicPr>
+                    <pic:cNvPr id="1989431065" name="Рисунок 1989431065"/>
+                    <pic:cNvPicPr/>
+                  </pic:nvPicPr>
+                  <pic:blipFill>
+                    <a:blip r:embed="rId14" cstate="print">
+                      <a:extLst>
+                        <a:ext uri="{28A0092B-C50C-407E-A947-70E740481C1C}">
+                          <a14:useLocalDpi xmlns:a14="http://schemas.microsoft.com/office/drawing/2010/main" val="0"/>
+                        </a:ext>
+                      </a:extLst>
+                    </a:blip>
+                    <a:stretch>
+                      <a:fillRect/>
+                    </a:stretch>
+                  </pic:blipFill>
+                  <pic:spPr>
+                    <a:xfrm>
+                      <a:off x="0" y="0"/>
+                      <a:ext cx="6120130" cy="1805940"/>
+                    </a:xfrm>
+                    <a:prstGeom prst="rect">
+                      <a:avLst/>
+                    </a:prstGeom>
+                  </pic:spPr>
+                </pic:pic>
+              </a:graphicData>
+            </a:graphic>
+          </wp:inline>
+        </w:drawing>
+      </w:r>
+    </w:p>
+    <w:p>
+      <w:r>
+        <w:t>Страница со статистикой:</w:t>
+      </w:r>
+    </w:p>
+    <w:p>
+      <w:pPr>
+        <w:pStyle w:val="a6"/>
+      </w:pPr>
+      <w:r>
+        <w:rPr>
+          <w:noProof/>
+        </w:rPr>
+        <w:drawing>
+          <wp:inline distT="0" distB="0" distL="0" distR="0" wp14:anchorId="3E69EE25" wp14:editId="5249F14F">
+            <wp:extent cx="6120130" cy="2717800"/>
+            <wp:effectExtent l="0" t="0" r="0" b="6350"/>
+            <wp:docPr id="218499688" name="Рисунок 7"/>
+            <wp:cNvGraphicFramePr>
+              <a:graphicFrameLocks xmlns:a="http://schemas.openxmlformats.org/drawingml/2006/main" noChangeAspect="1"/>
+            </wp:cNvGraphicFramePr>
+            <a:graphic xmlns:a="http://schemas.openxmlformats.org/drawingml/2006/main">
+              <a:graphicData uri="http://schemas.openxmlformats.org/drawingml/2006/picture">
+                <pic:pic xmlns:pic="http://schemas.openxmlformats.org/drawingml/2006/picture">
+                  <pic:nvPicPr>
+                    <pic:cNvPr id="218499688" name="Рисунок 218499688"/>
+                    <pic:cNvPicPr/>
+                  </pic:nvPicPr>
+                  <pic:blipFill>
+                    <a:blip r:embed="rId15" cstate="print">
+                      <a:extLst>
+                        <a:ext uri="{28A0092B-C50C-407E-A947-70E740481C1C}">
+                          <a14:useLocalDpi xmlns:a14="http://schemas.microsoft.com/office/drawing/2010/main" val="0"/>
+                        </a:ext>
+                      </a:extLst>
+                    </a:blip>
+                    <a:stretch>
+                      <a:fillRect/>
+                    </a:stretch>
+                  </pic:blipFill>
+                  <pic:spPr>
+                    <a:xfrm>
+                      <a:off x="0" y="0"/>
+                      <a:ext cx="6120130" cy="2717800"/>
+                    </a:xfrm>
+                    <a:prstGeom prst="rect">
+                      <a:avLst/>
+                    </a:prstGeom>
+                  </pic:spPr>
+                </pic:pic>
+              </a:graphicData>
+            </a:graphic>
+          </wp:inline>
+        </w:drawing>
+      </w:r>
+    </w:p>
+    <w:p>
+      <w:r>
+        <w:t>Страница с информацией о профиле пользователя:</w:t>
+      </w:r>
+    </w:p>
+    <w:p>
+      <w:pPr>
+        <w:pStyle w:val="a6"/>
+      </w:pPr>
+      <w:r>
+        <w:rPr>
+          <w:noProof/>
+        </w:rPr>
+        <w:lastRenderedPageBreak/>
+        <w:drawing>
+          <wp:inline distT="0" distB="0" distL="0" distR="0" wp14:anchorId="72E59EBE" wp14:editId="71A7ED5D">
+            <wp:extent cx="6120130" cy="3260725"/>
+            <wp:effectExtent l="0" t="0" r="0" b="0"/>
+            <wp:docPr id="2005082096" name="Рисунок 8"/>
+            <wp:cNvGraphicFramePr>
+              <a:graphicFrameLocks xmlns:a="http://schemas.openxmlformats.org/drawingml/2006/main" noChangeAspect="1"/>
+            </wp:cNvGraphicFramePr>
+            <a:graphic xmlns:a="http://schemas.openxmlformats.org/drawingml/2006/main">
+              <a:graphicData uri="http://schemas.openxmlformats.org/drawingml/2006/picture">
+                <pic:pic xmlns:pic="http://schemas.openxmlformats.org/drawingml/2006/picture">
+                  <pic:nvPicPr>
+                    <pic:cNvPr id="2005082096" name="Рисунок 2005082096"/>
+                    <pic:cNvPicPr/>
+                  </pic:nvPicPr>
+                  <pic:blipFill>
+                    <a:blip r:embed="rId16" cstate="print">
+                      <a:extLst>
+                        <a:ext uri="{28A0092B-C50C-407E-A947-70E740481C1C}">
+                          <a14:useLocalDpi xmlns:a14="http://schemas.microsoft.com/office/drawing/2010/main" val="0"/>
+                        </a:ext>
+                      </a:extLst>
+                    </a:blip>
+                    <a:stretch>
+                      <a:fillRect/>
+                    </a:stretch>
+                  </pic:blipFill>
+                  <pic:spPr>
+                    <a:xfrm>
+                      <a:off x="0" y="0"/>
+                      <a:ext cx="6120130" cy="3260725"/>
+                    </a:xfrm>
+                    <a:prstGeom prst="rect">
+                      <a:avLst/>
+                    </a:prstGeom>
+                  </pic:spPr>
+                </pic:pic>
+              </a:graphicData>
+            </a:graphic>
+          </wp:inline>
+        </w:drawing>
+      </w:r>
+    </w:p>
     <w:p>
       <w:pPr>
         <w:pStyle w:val="2"/>
@@ -9130,12 +9578,6 @@
                 <w:rFonts w:cs="Times New Roman"/>
               </w:rPr>
               <w:br/>
-            </w:r>
-            <w:r>
-              <w:rPr>
-                <w:rFonts w:cs="Times New Roman"/>
-              </w:rPr>
-              <w:lastRenderedPageBreak/>
               <w:t xml:space="preserve">│ │ ├── </w:t>
             </w:r>
             <w:proofErr w:type="spellStart"/>
@@ -9199,6 +9641,12 @@
                 <w:rFonts w:cs="Times New Roman"/>
               </w:rPr>
               <w:br/>
+            </w:r>
+            <w:r>
+              <w:rPr>
+                <w:rFonts w:cs="Times New Roman"/>
+              </w:rPr>
+              <w:lastRenderedPageBreak/>
               <w:t>│ │</w:t>
             </w:r>
             <w:r>
@@ -9710,12 +10158,6 @@
                 <w:rFonts w:cs="Times New Roman"/>
               </w:rPr>
               <w:br/>
-            </w:r>
-            <w:r>
-              <w:rPr>
-                <w:rFonts w:cs="Times New Roman"/>
-              </w:rPr>
-              <w:lastRenderedPageBreak/>
               <w:t>│</w:t>
             </w:r>
             <w:r>
@@ -9765,6 +10207,12 @@
                 <w:rFonts w:cs="Times New Roman"/>
               </w:rPr>
               <w:br/>
+            </w:r>
+            <w:r>
+              <w:rPr>
+                <w:rFonts w:cs="Times New Roman"/>
+              </w:rPr>
+              <w:lastRenderedPageBreak/>
               <w:t xml:space="preserve">│ ├── </w:t>
             </w:r>
             <w:proofErr w:type="spellStart"/>
@@ -11669,6 +12117,7 @@
   <w:style w:type="character" w:default="1" w:styleId="a0">
     <w:name w:val="Default Paragraph Font"/>
     <w:uiPriority w:val="1"/>
+    <w:semiHidden/>
     <w:unhideWhenUsed/>
   </w:style>
   <w:style w:type="table" w:default="1" w:styleId="a1">

</xml_diff>

<commit_message>
fix: fixed api endpoints in frontend and add secrets in env
</commit_message>
<xml_diff>
--- a/documents/Отчет по СПО (проект 2).docx
+++ b/documents/Отчет по СПО (проект 2).docx
@@ -5369,18 +5369,17 @@
       <w:tblPr>
         <w:tblStyle w:val="af6"/>
         <w:tblW w:w="5000" w:type="pct"/>
-        <w:tblLayout w:type="fixed"/>
         <w:tblLook w:val="04A0" w:firstRow="1" w:lastRow="0" w:firstColumn="1" w:lastColumn="0" w:noHBand="0" w:noVBand="1"/>
       </w:tblPr>
       <w:tblGrid>
-        <w:gridCol w:w="341"/>
-        <w:gridCol w:w="1038"/>
-        <w:gridCol w:w="1313"/>
-        <w:gridCol w:w="1700"/>
-        <w:gridCol w:w="1698"/>
-        <w:gridCol w:w="992"/>
-        <w:gridCol w:w="994"/>
-        <w:gridCol w:w="1552"/>
+        <w:gridCol w:w="377"/>
+        <w:gridCol w:w="917"/>
+        <w:gridCol w:w="2516"/>
+        <w:gridCol w:w="1213"/>
+        <w:gridCol w:w="1269"/>
+        <w:gridCol w:w="1417"/>
+        <w:gridCol w:w="1051"/>
+        <w:gridCol w:w="868"/>
       </w:tblGrid>
       <w:tr>
         <w:trPr>
@@ -5578,7 +5577,6 @@
         <w:tc>
           <w:tcPr>
             <w:tcW w:w="516" w:type="pct"/>
-            <w:noWrap/>
             <w:hideMark/>
           </w:tcPr>
           <w:p>
@@ -5757,16 +5755,115 @@
         <w:tc>
           <w:tcPr>
             <w:tcW w:w="516" w:type="pct"/>
-            <w:noWrap/>
-            <w:hideMark/>
-          </w:tcPr>
-          <w:p>
-            <w:pPr>
-              <w:pStyle w:val="aa"/>
-              <w:rPr>
-                <w:lang w:val="en-US"/>
-              </w:rPr>
-            </w:pPr>
+            <w:hideMark/>
+          </w:tcPr>
+          <w:p>
+            <w:pPr>
+              <w:pStyle w:val="aa"/>
+              <w:rPr>
+                <w:rFonts w:asciiTheme="minorHAnsi" w:hAnsiTheme="minorHAnsi"/>
+                <w:sz w:val="22"/>
+              </w:rPr>
+            </w:pPr>
+            <w:r>
+              <w:t>400</w:t>
+            </w:r>
+            <w:r>
+              <w:rPr>
+                <w:rFonts w:asciiTheme="minorHAnsi" w:hAnsiTheme="minorHAnsi"/>
+                <w:sz w:val="22"/>
+              </w:rPr>
+              <w:t xml:space="preserve"> - </w:t>
+            </w:r>
+            <w:proofErr w:type="spellStart"/>
+            <w:r>
+              <w:rPr>
+                <w:rFonts w:asciiTheme="minorHAnsi" w:hAnsiTheme="minorHAnsi"/>
+                <w:sz w:val="22"/>
+              </w:rPr>
+              <w:t>невалидный</w:t>
+            </w:r>
+            <w:proofErr w:type="spellEnd"/>
+            <w:r>
+              <w:rPr>
+                <w:rFonts w:asciiTheme="minorHAnsi" w:hAnsiTheme="minorHAnsi"/>
+                <w:sz w:val="22"/>
+              </w:rPr>
+              <w:t xml:space="preserve"> </w:t>
+            </w:r>
+            <w:proofErr w:type="spellStart"/>
+            <w:r>
+              <w:rPr>
+                <w:rFonts w:asciiTheme="minorHAnsi" w:hAnsiTheme="minorHAnsi"/>
+                <w:sz w:val="22"/>
+              </w:rPr>
+              <w:t>email</w:t>
+            </w:r>
+            <w:proofErr w:type="spellEnd"/>
+            <w:r>
+              <w:rPr>
+                <w:rFonts w:asciiTheme="minorHAnsi" w:hAnsiTheme="minorHAnsi"/>
+                <w:sz w:val="22"/>
+              </w:rPr>
+              <w:t xml:space="preserve"> или пустой </w:t>
+            </w:r>
+            <w:proofErr w:type="spellStart"/>
+            <w:r>
+              <w:rPr>
+                <w:rFonts w:asciiTheme="minorHAnsi" w:hAnsiTheme="minorHAnsi"/>
+                <w:sz w:val="22"/>
+              </w:rPr>
+              <w:t>username</w:t>
+            </w:r>
+            <w:proofErr w:type="spellEnd"/>
+            <w:r>
+              <w:rPr>
+                <w:rFonts w:asciiTheme="minorHAnsi" w:hAnsiTheme="minorHAnsi"/>
+                <w:sz w:val="22"/>
+              </w:rPr>
+              <w:br/>
+              <w:t xml:space="preserve">409 - </w:t>
+            </w:r>
+            <w:proofErr w:type="spellStart"/>
+            <w:r>
+              <w:rPr>
+                <w:rFonts w:asciiTheme="minorHAnsi" w:hAnsiTheme="minorHAnsi"/>
+                <w:sz w:val="22"/>
+              </w:rPr>
+              <w:t>email</w:t>
+            </w:r>
+            <w:proofErr w:type="spellEnd"/>
+            <w:r>
+              <w:rPr>
+                <w:rFonts w:asciiTheme="minorHAnsi" w:hAnsiTheme="minorHAnsi"/>
+                <w:sz w:val="22"/>
+              </w:rPr>
+              <w:t xml:space="preserve"> уже зарегистрирован</w:t>
+            </w:r>
+            <w:r>
+              <w:rPr>
+                <w:rFonts w:asciiTheme="minorHAnsi" w:hAnsiTheme="minorHAnsi"/>
+                <w:sz w:val="22"/>
+              </w:rPr>
+              <w:br/>
+              <w:t xml:space="preserve">422 - пропущены </w:t>
+            </w:r>
+            <w:r>
+              <w:rPr>
+                <w:rFonts w:asciiTheme="minorHAnsi" w:hAnsiTheme="minorHAnsi"/>
+                <w:sz w:val="22"/>
+              </w:rPr>
+              <w:lastRenderedPageBreak/>
+              <w:t>обязательные поля</w:t>
+            </w:r>
+            <w:r>
+              <w:rPr>
+                <w:rFonts w:asciiTheme="minorHAnsi" w:hAnsiTheme="minorHAnsi"/>
+                <w:sz w:val="22"/>
+              </w:rPr>
+              <w:br/>
+              <w:t>500 - ошибка сервера</w:t>
+            </w:r>
           </w:p>
         </w:tc>
         <w:tc>
@@ -5779,6 +5876,7 @@
               <w:pStyle w:val="aa"/>
             </w:pPr>
             <w:r>
+              <w:lastRenderedPageBreak/>
               <w:t>Создать учётную запись</w:t>
             </w:r>
           </w:p>
@@ -5925,13 +6023,84 @@
         <w:tc>
           <w:tcPr>
             <w:tcW w:w="516" w:type="pct"/>
-            <w:noWrap/>
-            <w:hideMark/>
-          </w:tcPr>
-          <w:p>
-            <w:pPr>
-              <w:pStyle w:val="aa"/>
-            </w:pPr>
+            <w:hideMark/>
+          </w:tcPr>
+          <w:p>
+            <w:pPr>
+              <w:pStyle w:val="aa"/>
+              <w:rPr>
+                <w:rFonts w:asciiTheme="minorHAnsi" w:hAnsiTheme="minorHAnsi"/>
+                <w:sz w:val="22"/>
+              </w:rPr>
+            </w:pPr>
+            <w:r>
+              <w:t>400</w:t>
+            </w:r>
+            <w:r>
+              <w:rPr>
+                <w:rFonts w:asciiTheme="minorHAnsi" w:hAnsiTheme="minorHAnsi"/>
+                <w:sz w:val="22"/>
+              </w:rPr>
+              <w:t xml:space="preserve"> - неверный </w:t>
+            </w:r>
+            <w:proofErr w:type="spellStart"/>
+            <w:r>
+              <w:rPr>
+                <w:rFonts w:asciiTheme="minorHAnsi" w:hAnsiTheme="minorHAnsi"/>
+                <w:sz w:val="22"/>
+              </w:rPr>
+              <w:t>grant_type</w:t>
+            </w:r>
+            <w:proofErr w:type="spellEnd"/>
+            <w:r>
+              <w:rPr>
+                <w:rFonts w:asciiTheme="minorHAnsi" w:hAnsiTheme="minorHAnsi"/>
+                <w:sz w:val="22"/>
+              </w:rPr>
+              <w:br/>
+              <w:t xml:space="preserve">401 - неверный </w:t>
+            </w:r>
+            <w:proofErr w:type="spellStart"/>
+            <w:r>
+              <w:rPr>
+                <w:rFonts w:asciiTheme="minorHAnsi" w:hAnsiTheme="minorHAnsi"/>
+                <w:sz w:val="22"/>
+              </w:rPr>
+              <w:t>username</w:t>
+            </w:r>
+            <w:proofErr w:type="spellEnd"/>
+            <w:r>
+              <w:rPr>
+                <w:rFonts w:asciiTheme="minorHAnsi" w:hAnsiTheme="minorHAnsi"/>
+                <w:sz w:val="22"/>
+              </w:rPr>
+              <w:t xml:space="preserve"> или </w:t>
+            </w:r>
+            <w:proofErr w:type="spellStart"/>
+            <w:r>
+              <w:rPr>
+                <w:rFonts w:asciiTheme="minorHAnsi" w:hAnsiTheme="minorHAnsi"/>
+                <w:sz w:val="22"/>
+              </w:rPr>
+              <w:t>password_hash</w:t>
+            </w:r>
+            <w:proofErr w:type="spellEnd"/>
+            <w:r>
+              <w:rPr>
+                <w:rFonts w:asciiTheme="minorHAnsi" w:hAnsiTheme="minorHAnsi"/>
+                <w:sz w:val="22"/>
+              </w:rPr>
+              <w:br/>
+              <w:t>422 - пропущены обязательные поля</w:t>
+            </w:r>
+            <w:r>
+              <w:rPr>
+                <w:rFonts w:asciiTheme="minorHAnsi" w:hAnsiTheme="minorHAnsi"/>
+                <w:sz w:val="22"/>
+              </w:rPr>
+              <w:br/>
+              <w:t>500 - ошибка сервера</w:t>
+            </w:r>
           </w:p>
         </w:tc>
         <w:tc>
@@ -6082,13 +6251,84 @@
         <w:tc>
           <w:tcPr>
             <w:tcW w:w="516" w:type="pct"/>
-            <w:noWrap/>
-            <w:hideMark/>
-          </w:tcPr>
-          <w:p>
-            <w:pPr>
-              <w:pStyle w:val="aa"/>
-            </w:pPr>
+            <w:hideMark/>
+          </w:tcPr>
+          <w:p>
+            <w:pPr>
+              <w:pStyle w:val="aa"/>
+              <w:rPr>
+                <w:rFonts w:asciiTheme="minorHAnsi" w:hAnsiTheme="minorHAnsi"/>
+                <w:sz w:val="22"/>
+              </w:rPr>
+            </w:pPr>
+            <w:r>
+              <w:t>400</w:t>
+            </w:r>
+            <w:r>
+              <w:rPr>
+                <w:rFonts w:asciiTheme="minorHAnsi" w:hAnsiTheme="minorHAnsi"/>
+                <w:sz w:val="22"/>
+              </w:rPr>
+              <w:t xml:space="preserve"> - неверный </w:t>
+            </w:r>
+            <w:proofErr w:type="spellStart"/>
+            <w:r>
+              <w:rPr>
+                <w:rFonts w:asciiTheme="minorHAnsi" w:hAnsiTheme="minorHAnsi"/>
+                <w:sz w:val="22"/>
+              </w:rPr>
+              <w:t>grant_type</w:t>
+            </w:r>
+            <w:proofErr w:type="spellEnd"/>
+            <w:r>
+              <w:rPr>
+                <w:rFonts w:asciiTheme="minorHAnsi" w:hAnsiTheme="minorHAnsi"/>
+                <w:sz w:val="22"/>
+              </w:rPr>
+              <w:br/>
+              <w:t xml:space="preserve">401 - </w:t>
+            </w:r>
+            <w:proofErr w:type="spellStart"/>
+            <w:r>
+              <w:rPr>
+                <w:rFonts w:asciiTheme="minorHAnsi" w:hAnsiTheme="minorHAnsi"/>
+                <w:sz w:val="22"/>
+              </w:rPr>
+              <w:t>refresh_token</w:t>
+            </w:r>
+            <w:proofErr w:type="spellEnd"/>
+            <w:r>
+              <w:rPr>
+                <w:rFonts w:asciiTheme="minorHAnsi" w:hAnsiTheme="minorHAnsi"/>
+                <w:sz w:val="22"/>
+              </w:rPr>
+              <w:t xml:space="preserve"> недействителен или истёк</w:t>
+            </w:r>
+            <w:r>
+              <w:rPr>
+                <w:rFonts w:asciiTheme="minorHAnsi" w:hAnsiTheme="minorHAnsi"/>
+                <w:sz w:val="22"/>
+              </w:rPr>
+              <w:br/>
+              <w:t xml:space="preserve">422 - пропущено поле </w:t>
+            </w:r>
+            <w:proofErr w:type="spellStart"/>
+            <w:r>
+              <w:rPr>
+                <w:rFonts w:asciiTheme="minorHAnsi" w:hAnsiTheme="minorHAnsi"/>
+                <w:sz w:val="22"/>
+              </w:rPr>
+              <w:t>refresh_token</w:t>
+            </w:r>
+            <w:proofErr w:type="spellEnd"/>
+            <w:r>
+              <w:rPr>
+                <w:rFonts w:asciiTheme="minorHAnsi" w:hAnsiTheme="minorHAnsi"/>
+                <w:sz w:val="22"/>
+              </w:rPr>
+              <w:br/>
+              <w:t>500 - ошибка сервера</w:t>
+            </w:r>
           </w:p>
         </w:tc>
         <w:tc>
@@ -6165,7 +6405,6 @@
         <w:tc>
           <w:tcPr>
             <w:tcW w:w="516" w:type="pct"/>
-            <w:noWrap/>
             <w:hideMark/>
           </w:tcPr>
           <w:p>
@@ -6202,7 +6441,6 @@
               <w:pStyle w:val="aa"/>
             </w:pPr>
             <w:r>
-              <w:lastRenderedPageBreak/>
               <w:t>4</w:t>
             </w:r>
           </w:p>
@@ -6316,13 +6554,57 @@
         <w:tc>
           <w:tcPr>
             <w:tcW w:w="516" w:type="pct"/>
-            <w:noWrap/>
-            <w:hideMark/>
-          </w:tcPr>
-          <w:p>
-            <w:pPr>
-              <w:pStyle w:val="aa"/>
-            </w:pPr>
+            <w:hideMark/>
+          </w:tcPr>
+          <w:p>
+            <w:pPr>
+              <w:pStyle w:val="aa"/>
+              <w:rPr>
+                <w:rFonts w:asciiTheme="minorHAnsi" w:hAnsiTheme="minorHAnsi"/>
+                <w:sz w:val="22"/>
+              </w:rPr>
+            </w:pPr>
+            <w:r>
+              <w:t>401</w:t>
+            </w:r>
+            <w:r>
+              <w:rPr>
+                <w:rFonts w:asciiTheme="minorHAnsi" w:hAnsiTheme="minorHAnsi"/>
+                <w:sz w:val="22"/>
+              </w:rPr>
+              <w:t xml:space="preserve"> - нет токена авторизации</w:t>
+            </w:r>
+            <w:r>
+              <w:rPr>
+                <w:rFonts w:asciiTheme="minorHAnsi" w:hAnsiTheme="minorHAnsi"/>
+                <w:sz w:val="22"/>
+              </w:rPr>
+              <w:br/>
+            </w:r>
+            <w:r>
+              <w:rPr>
+                <w:rFonts w:asciiTheme="minorHAnsi" w:hAnsiTheme="minorHAnsi"/>
+                <w:sz w:val="22"/>
+              </w:rPr>
+              <w:lastRenderedPageBreak/>
+              <w:t>403 - попытка получить чужой профиль</w:t>
+            </w:r>
+            <w:r>
+              <w:rPr>
+                <w:rFonts w:asciiTheme="minorHAnsi" w:hAnsiTheme="minorHAnsi"/>
+                <w:sz w:val="22"/>
+              </w:rPr>
+              <w:br/>
+              <w:t>404 - пользователь не найден</w:t>
+            </w:r>
+            <w:r>
+              <w:rPr>
+                <w:rFonts w:asciiTheme="minorHAnsi" w:hAnsiTheme="minorHAnsi"/>
+                <w:sz w:val="22"/>
+              </w:rPr>
+              <w:br/>
+              <w:t>500 - ошибка сервера</w:t>
+            </w:r>
           </w:p>
         </w:tc>
         <w:tc>
@@ -6335,7 +6617,12 @@
               <w:pStyle w:val="aa"/>
             </w:pPr>
             <w:r>
-              <w:t>Получить данные профиля</w:t>
+              <w:lastRenderedPageBreak/>
+              <w:t xml:space="preserve">Получить данные </w:t>
+            </w:r>
+            <w:r>
+              <w:lastRenderedPageBreak/>
+              <w:t>профиля</w:t>
             </w:r>
           </w:p>
         </w:tc>
@@ -6355,6 +6642,7 @@
               <w:pStyle w:val="aa"/>
             </w:pPr>
             <w:r>
+              <w:lastRenderedPageBreak/>
               <w:t>5</w:t>
             </w:r>
           </w:p>
@@ -6495,13 +6783,106 @@
         <w:tc>
           <w:tcPr>
             <w:tcW w:w="516" w:type="pct"/>
-            <w:noWrap/>
-            <w:hideMark/>
-          </w:tcPr>
-          <w:p>
-            <w:pPr>
-              <w:pStyle w:val="aa"/>
-            </w:pPr>
+            <w:hideMark/>
+          </w:tcPr>
+          <w:p>
+            <w:pPr>
+              <w:pStyle w:val="aa"/>
+              <w:rPr>
+                <w:rFonts w:asciiTheme="minorHAnsi" w:hAnsiTheme="minorHAnsi"/>
+                <w:sz w:val="22"/>
+              </w:rPr>
+            </w:pPr>
+            <w:r>
+              <w:t>400</w:t>
+            </w:r>
+            <w:r>
+              <w:rPr>
+                <w:rFonts w:asciiTheme="minorHAnsi" w:hAnsiTheme="minorHAnsi"/>
+                <w:sz w:val="22"/>
+              </w:rPr>
+              <w:t xml:space="preserve"> - </w:t>
+            </w:r>
+            <w:proofErr w:type="spellStart"/>
+            <w:r>
+              <w:rPr>
+                <w:rFonts w:asciiTheme="minorHAnsi" w:hAnsiTheme="minorHAnsi"/>
+                <w:sz w:val="22"/>
+              </w:rPr>
+              <w:t>невалидные</w:t>
+            </w:r>
+            <w:proofErr w:type="spellEnd"/>
+            <w:r>
+              <w:rPr>
+                <w:rFonts w:asciiTheme="minorHAnsi" w:hAnsiTheme="minorHAnsi"/>
+                <w:sz w:val="22"/>
+              </w:rPr>
+              <w:t xml:space="preserve"> данные</w:t>
+            </w:r>
+            <w:r>
+              <w:rPr>
+                <w:rFonts w:asciiTheme="minorHAnsi" w:hAnsiTheme="minorHAnsi"/>
+                <w:sz w:val="22"/>
+              </w:rPr>
+              <w:br/>
+              <w:t>401 - нет токена авторизации</w:t>
+            </w:r>
+            <w:r>
+              <w:rPr>
+                <w:rFonts w:asciiTheme="minorHAnsi" w:hAnsiTheme="minorHAnsi"/>
+                <w:sz w:val="22"/>
+              </w:rPr>
+              <w:br/>
+              <w:t>403 - попытка изменить чужой профиль</w:t>
+            </w:r>
+            <w:r>
+              <w:rPr>
+                <w:rFonts w:asciiTheme="minorHAnsi" w:hAnsiTheme="minorHAnsi"/>
+                <w:sz w:val="22"/>
+              </w:rPr>
+              <w:br/>
+              <w:t>404 - пользователь не найден</w:t>
+            </w:r>
+            <w:r>
+              <w:rPr>
+                <w:rFonts w:asciiTheme="minorHAnsi" w:hAnsiTheme="minorHAnsi"/>
+                <w:sz w:val="22"/>
+              </w:rPr>
+              <w:br/>
+              <w:t xml:space="preserve">409 - новый </w:t>
+            </w:r>
+            <w:proofErr w:type="spellStart"/>
+            <w:r>
+              <w:rPr>
+                <w:rFonts w:asciiTheme="minorHAnsi" w:hAnsiTheme="minorHAnsi"/>
+                <w:sz w:val="22"/>
+              </w:rPr>
+              <w:t>email</w:t>
+            </w:r>
+            <w:proofErr w:type="spellEnd"/>
+            <w:r>
+              <w:rPr>
+                <w:rFonts w:asciiTheme="minorHAnsi" w:hAnsiTheme="minorHAnsi"/>
+                <w:sz w:val="22"/>
+              </w:rPr>
+              <w:t xml:space="preserve"> уже занят</w:t>
+            </w:r>
+            <w:r>
+              <w:rPr>
+                <w:rFonts w:asciiTheme="minorHAnsi" w:hAnsiTheme="minorHAnsi"/>
+                <w:sz w:val="22"/>
+              </w:rPr>
+              <w:br/>
+              <w:t>422 - пропущены обязательные поля</w:t>
+            </w:r>
+            <w:r>
+              <w:rPr>
+                <w:rFonts w:asciiTheme="minorHAnsi" w:hAnsiTheme="minorHAnsi"/>
+                <w:sz w:val="22"/>
+              </w:rPr>
+              <w:br/>
+              <w:t>500 - ошибка сервера</w:t>
+            </w:r>
           </w:p>
         </w:tc>
         <w:tc>
@@ -6620,13 +7001,58 @@
         <w:tc>
           <w:tcPr>
             <w:tcW w:w="516" w:type="pct"/>
-            <w:noWrap/>
-            <w:hideMark/>
-          </w:tcPr>
-          <w:p>
-            <w:pPr>
-              <w:pStyle w:val="aa"/>
-            </w:pPr>
+            <w:hideMark/>
+          </w:tcPr>
+          <w:p>
+            <w:pPr>
+              <w:pStyle w:val="aa"/>
+              <w:rPr>
+                <w:rFonts w:asciiTheme="minorHAnsi" w:hAnsiTheme="minorHAnsi"/>
+                <w:sz w:val="22"/>
+              </w:rPr>
+            </w:pPr>
+            <w:r>
+              <w:t>401</w:t>
+            </w:r>
+            <w:r>
+              <w:rPr>
+                <w:rFonts w:asciiTheme="minorHAnsi" w:hAnsiTheme="minorHAnsi"/>
+                <w:sz w:val="22"/>
+              </w:rPr>
+              <w:t xml:space="preserve"> - нет токена авторизации</w:t>
+            </w:r>
+            <w:r>
+              <w:rPr>
+                <w:rFonts w:asciiTheme="minorHAnsi" w:hAnsiTheme="minorHAnsi"/>
+                <w:sz w:val="22"/>
+              </w:rPr>
+              <w:br/>
+              <w:t xml:space="preserve">403 - попытка удалить </w:t>
+            </w:r>
+            <w:r>
+              <w:rPr>
+                <w:rFonts w:asciiTheme="minorHAnsi" w:hAnsiTheme="minorHAnsi"/>
+                <w:sz w:val="22"/>
+              </w:rPr>
+              <w:lastRenderedPageBreak/>
+              <w:t>чужой аккаунт</w:t>
+            </w:r>
+            <w:r>
+              <w:rPr>
+                <w:rFonts w:asciiTheme="minorHAnsi" w:hAnsiTheme="minorHAnsi"/>
+                <w:sz w:val="22"/>
+              </w:rPr>
+              <w:br/>
+              <w:t>404 - пользователь не найден</w:t>
+            </w:r>
+            <w:r>
+              <w:rPr>
+                <w:rFonts w:asciiTheme="minorHAnsi" w:hAnsiTheme="minorHAnsi"/>
+                <w:sz w:val="22"/>
+              </w:rPr>
+              <w:br/>
+              <w:t>500 - ошибка сервера</w:t>
+            </w:r>
           </w:p>
         </w:tc>
         <w:tc>
@@ -6639,6 +7065,7 @@
               <w:pStyle w:val="aa"/>
             </w:pPr>
             <w:r>
+              <w:lastRenderedPageBreak/>
               <w:t>Удалить свой аккаунт</w:t>
             </w:r>
           </w:p>
@@ -6979,13 +7406,139 @@
         <w:tc>
           <w:tcPr>
             <w:tcW w:w="516" w:type="pct"/>
-            <w:noWrap/>
-            <w:hideMark/>
-          </w:tcPr>
-          <w:p>
-            <w:pPr>
-              <w:pStyle w:val="aa"/>
-            </w:pPr>
+            <w:hideMark/>
+          </w:tcPr>
+          <w:p>
+            <w:pPr>
+              <w:pStyle w:val="aa"/>
+              <w:rPr>
+                <w:rFonts w:asciiTheme="minorHAnsi" w:hAnsiTheme="minorHAnsi"/>
+                <w:sz w:val="22"/>
+              </w:rPr>
+            </w:pPr>
+            <w:r>
+              <w:t>400</w:t>
+            </w:r>
+            <w:r>
+              <w:rPr>
+                <w:rFonts w:asciiTheme="minorHAnsi" w:hAnsiTheme="minorHAnsi"/>
+                <w:sz w:val="22"/>
+              </w:rPr>
+              <w:t xml:space="preserve"> - неверный </w:t>
+            </w:r>
+            <w:proofErr w:type="spellStart"/>
+            <w:r>
+              <w:rPr>
+                <w:rFonts w:asciiTheme="minorHAnsi" w:hAnsiTheme="minorHAnsi"/>
+                <w:sz w:val="22"/>
+              </w:rPr>
+              <w:t>transaction_type</w:t>
+            </w:r>
+            <w:proofErr w:type="spellEnd"/>
+            <w:r>
+              <w:rPr>
+                <w:rFonts w:asciiTheme="minorHAnsi" w:hAnsiTheme="minorHAnsi"/>
+                <w:sz w:val="22"/>
+              </w:rPr>
+              <w:t xml:space="preserve"> (не </w:t>
+            </w:r>
+            <w:proofErr w:type="spellStart"/>
+            <w:r>
+              <w:rPr>
+                <w:rFonts w:asciiTheme="minorHAnsi" w:hAnsiTheme="minorHAnsi"/>
+                <w:sz w:val="22"/>
+              </w:rPr>
+              <w:t>income</w:t>
+            </w:r>
+            <w:proofErr w:type="spellEnd"/>
+            <w:r>
+              <w:rPr>
+                <w:rFonts w:asciiTheme="minorHAnsi" w:hAnsiTheme="minorHAnsi"/>
+                <w:sz w:val="22"/>
+              </w:rPr>
+              <w:t xml:space="preserve"> и не </w:t>
+            </w:r>
+            <w:proofErr w:type="spellStart"/>
+            <w:r>
+              <w:rPr>
+                <w:rFonts w:asciiTheme="minorHAnsi" w:hAnsiTheme="minorHAnsi"/>
+                <w:sz w:val="22"/>
+              </w:rPr>
+              <w:t>expense</w:t>
+            </w:r>
+            <w:proofErr w:type="spellEnd"/>
+            <w:r>
+              <w:rPr>
+                <w:rFonts w:asciiTheme="minorHAnsi" w:hAnsiTheme="minorHAnsi"/>
+                <w:sz w:val="22"/>
+              </w:rPr>
+              <w:t>)</w:t>
+            </w:r>
+            <w:r>
+              <w:rPr>
+                <w:rFonts w:asciiTheme="minorHAnsi" w:hAnsiTheme="minorHAnsi"/>
+                <w:sz w:val="22"/>
+              </w:rPr>
+              <w:br/>
+              <w:t>401 - нет токена авторизации</w:t>
+            </w:r>
+            <w:r>
+              <w:rPr>
+                <w:rFonts w:asciiTheme="minorHAnsi" w:hAnsiTheme="minorHAnsi"/>
+                <w:sz w:val="22"/>
+              </w:rPr>
+              <w:br/>
+              <w:t>403 - попытка получить чужие транзакции</w:t>
+            </w:r>
+            <w:r>
+              <w:rPr>
+                <w:rFonts w:asciiTheme="minorHAnsi" w:hAnsiTheme="minorHAnsi"/>
+                <w:sz w:val="22"/>
+              </w:rPr>
+              <w:br/>
+              <w:t>404 - пользователь не найден</w:t>
+            </w:r>
+            <w:r>
+              <w:rPr>
+                <w:rFonts w:asciiTheme="minorHAnsi" w:hAnsiTheme="minorHAnsi"/>
+                <w:sz w:val="22"/>
+              </w:rPr>
+              <w:br/>
+              <w:t xml:space="preserve">422 - неверный формат </w:t>
+            </w:r>
+            <w:proofErr w:type="spellStart"/>
+            <w:r>
+              <w:rPr>
+                <w:rFonts w:asciiTheme="minorHAnsi" w:hAnsiTheme="minorHAnsi"/>
+                <w:sz w:val="22"/>
+              </w:rPr>
+              <w:t>start_date</w:t>
+            </w:r>
+            <w:proofErr w:type="spellEnd"/>
+            <w:r>
+              <w:rPr>
+                <w:rFonts w:asciiTheme="minorHAnsi" w:hAnsiTheme="minorHAnsi"/>
+                <w:sz w:val="22"/>
+              </w:rPr>
+              <w:t xml:space="preserve"> или </w:t>
+            </w:r>
+            <w:proofErr w:type="spellStart"/>
+            <w:r>
+              <w:rPr>
+                <w:rFonts w:asciiTheme="minorHAnsi" w:hAnsiTheme="minorHAnsi"/>
+                <w:sz w:val="22"/>
+              </w:rPr>
+              <w:t>end_date</w:t>
+            </w:r>
+            <w:proofErr w:type="spellEnd"/>
+            <w:r>
+              <w:rPr>
+                <w:rFonts w:asciiTheme="minorHAnsi" w:hAnsiTheme="minorHAnsi"/>
+                <w:sz w:val="22"/>
+              </w:rPr>
+              <w:br/>
+              <w:t>500 - ошибка сервера</w:t>
+            </w:r>
           </w:p>
         </w:tc>
         <w:tc>
@@ -7153,7 +7706,14 @@
               <w:rPr>
                 <w:lang w:val="en-US"/>
               </w:rPr>
-              <w:t>, amount, comment}</w:t>
+              <w:t xml:space="preserve">, amount, </w:t>
+            </w:r>
+            <w:r>
+              <w:rPr>
+                <w:lang w:val="en-US"/>
+              </w:rPr>
+              <w:lastRenderedPageBreak/>
+              <w:t>comment}</w:t>
             </w:r>
           </w:p>
         </w:tc>
@@ -7173,6 +7733,7 @@
               <w:rPr>
                 <w:lang w:val="en-US"/>
               </w:rPr>
+              <w:lastRenderedPageBreak/>
               <w:t>{</w:t>
             </w:r>
             <w:proofErr w:type="spellStart"/>
@@ -7243,7 +7804,14 @@
               <w:rPr>
                 <w:lang w:val="en-US"/>
               </w:rPr>
-              <w:t>, amount, comment}</w:t>
+              <w:t xml:space="preserve">, </w:t>
+            </w:r>
+            <w:r>
+              <w:rPr>
+                <w:lang w:val="en-US"/>
+              </w:rPr>
+              <w:lastRenderedPageBreak/>
+              <w:t>amount, comment}</w:t>
             </w:r>
           </w:p>
         </w:tc>
@@ -7264,16 +7832,115 @@
         <w:tc>
           <w:tcPr>
             <w:tcW w:w="516" w:type="pct"/>
-            <w:noWrap/>
-            <w:hideMark/>
-          </w:tcPr>
-          <w:p>
-            <w:pPr>
-              <w:pStyle w:val="aa"/>
-              <w:rPr>
-                <w:lang w:val="en-US"/>
-              </w:rPr>
-            </w:pPr>
+            <w:hideMark/>
+          </w:tcPr>
+          <w:p>
+            <w:pPr>
+              <w:pStyle w:val="aa"/>
+              <w:rPr>
+                <w:rFonts w:asciiTheme="minorHAnsi" w:hAnsiTheme="minorHAnsi"/>
+                <w:sz w:val="22"/>
+              </w:rPr>
+            </w:pPr>
+            <w:r>
+              <w:t>400</w:t>
+            </w:r>
+            <w:r>
+              <w:rPr>
+                <w:rFonts w:asciiTheme="minorHAnsi" w:hAnsiTheme="minorHAnsi"/>
+                <w:sz w:val="22"/>
+              </w:rPr>
+              <w:t xml:space="preserve"> - неверный </w:t>
+            </w:r>
+            <w:proofErr w:type="spellStart"/>
+            <w:r>
+              <w:rPr>
+                <w:rFonts w:asciiTheme="minorHAnsi" w:hAnsiTheme="minorHAnsi"/>
+                <w:sz w:val="22"/>
+              </w:rPr>
+              <w:t>transaction_type</w:t>
+            </w:r>
+            <w:proofErr w:type="spellEnd"/>
+            <w:r>
+              <w:rPr>
+                <w:rFonts w:asciiTheme="minorHAnsi" w:hAnsiTheme="minorHAnsi"/>
+                <w:sz w:val="22"/>
+              </w:rPr>
+              <w:br/>
+              <w:t>401 - нет токена авториз</w:t>
+            </w:r>
+            <w:r>
+              <w:rPr>
+                <w:rFonts w:asciiTheme="minorHAnsi" w:hAnsiTheme="minorHAnsi"/>
+                <w:sz w:val="22"/>
+              </w:rPr>
+              <w:lastRenderedPageBreak/>
+              <w:t>ации</w:t>
+            </w:r>
+            <w:r>
+              <w:rPr>
+                <w:rFonts w:asciiTheme="minorHAnsi" w:hAnsiTheme="minorHAnsi"/>
+                <w:sz w:val="22"/>
+              </w:rPr>
+              <w:br/>
+              <w:t>403 - попытка создать транзакцию для другого пользователя</w:t>
+            </w:r>
+            <w:r>
+              <w:rPr>
+                <w:rFonts w:asciiTheme="minorHAnsi" w:hAnsiTheme="minorHAnsi"/>
+                <w:sz w:val="22"/>
+              </w:rPr>
+              <w:br/>
+              <w:t xml:space="preserve">404 - </w:t>
+            </w:r>
+            <w:proofErr w:type="spellStart"/>
+            <w:r>
+              <w:rPr>
+                <w:rFonts w:asciiTheme="minorHAnsi" w:hAnsiTheme="minorHAnsi"/>
+                <w:sz w:val="22"/>
+              </w:rPr>
+              <w:t>place_id</w:t>
+            </w:r>
+            <w:proofErr w:type="spellEnd"/>
+            <w:r>
+              <w:rPr>
+                <w:rFonts w:asciiTheme="minorHAnsi" w:hAnsiTheme="minorHAnsi"/>
+                <w:sz w:val="22"/>
+              </w:rPr>
+              <w:t xml:space="preserve"> или </w:t>
+            </w:r>
+            <w:proofErr w:type="spellStart"/>
+            <w:r>
+              <w:rPr>
+                <w:rFonts w:asciiTheme="minorHAnsi" w:hAnsiTheme="minorHAnsi"/>
+                <w:sz w:val="22"/>
+              </w:rPr>
+              <w:t>category_id</w:t>
+            </w:r>
+            <w:proofErr w:type="spellEnd"/>
+            <w:r>
+              <w:rPr>
+                <w:rFonts w:asciiTheme="minorHAnsi" w:hAnsiTheme="minorHAnsi"/>
+                <w:sz w:val="22"/>
+              </w:rPr>
+              <w:t xml:space="preserve"> не найдены</w:t>
+            </w:r>
+            <w:r>
+              <w:rPr>
+                <w:rFonts w:asciiTheme="minorHAnsi" w:hAnsiTheme="minorHAnsi"/>
+                <w:sz w:val="22"/>
+              </w:rPr>
+              <w:br/>
+              <w:t>422 - пропущены обязательные поля, неверный формат даты или суммы</w:t>
+            </w:r>
+            <w:r>
+              <w:rPr>
+                <w:rFonts w:asciiTheme="minorHAnsi" w:hAnsiTheme="minorHAnsi"/>
+                <w:sz w:val="22"/>
+              </w:rPr>
+              <w:br/>
+              <w:t>500 - ошибка сервера</w:t>
+            </w:r>
           </w:p>
         </w:tc>
         <w:tc>
@@ -7286,6 +7953,7 @@
               <w:pStyle w:val="aa"/>
             </w:pPr>
             <w:r>
+              <w:lastRenderedPageBreak/>
               <w:t>Добавить новую транзакцию</w:t>
             </w:r>
           </w:p>
@@ -7570,16 +8238,115 @@
         <w:tc>
           <w:tcPr>
             <w:tcW w:w="516" w:type="pct"/>
-            <w:noWrap/>
-            <w:hideMark/>
-          </w:tcPr>
-          <w:p>
-            <w:pPr>
-              <w:pStyle w:val="aa"/>
-              <w:rPr>
-                <w:lang w:val="en-US"/>
-              </w:rPr>
-            </w:pPr>
+            <w:hideMark/>
+          </w:tcPr>
+          <w:p>
+            <w:pPr>
+              <w:pStyle w:val="aa"/>
+              <w:rPr>
+                <w:rFonts w:asciiTheme="minorHAnsi" w:hAnsiTheme="minorHAnsi"/>
+                <w:sz w:val="22"/>
+              </w:rPr>
+            </w:pPr>
+            <w:r>
+              <w:t>400</w:t>
+            </w:r>
+            <w:r>
+              <w:rPr>
+                <w:rFonts w:asciiTheme="minorHAnsi" w:hAnsiTheme="minorHAnsi"/>
+                <w:sz w:val="22"/>
+              </w:rPr>
+              <w:t xml:space="preserve"> - неверный </w:t>
+            </w:r>
+            <w:proofErr w:type="spellStart"/>
+            <w:r>
+              <w:rPr>
+                <w:rFonts w:asciiTheme="minorHAnsi" w:hAnsiTheme="minorHAnsi"/>
+                <w:sz w:val="22"/>
+              </w:rPr>
+              <w:t>transaction_type</w:t>
+            </w:r>
+            <w:proofErr w:type="spellEnd"/>
+            <w:r>
+              <w:rPr>
+                <w:rFonts w:asciiTheme="minorHAnsi" w:hAnsiTheme="minorHAnsi"/>
+                <w:sz w:val="22"/>
+              </w:rPr>
+              <w:br/>
+              <w:t>401 - нет токена авторизации</w:t>
+            </w:r>
+            <w:r>
+              <w:rPr>
+                <w:rFonts w:asciiTheme="minorHAnsi" w:hAnsiTheme="minorHAnsi"/>
+                <w:sz w:val="22"/>
+              </w:rPr>
+              <w:br/>
+              <w:t>403 - попытка изменить чужую транзакцию</w:t>
+            </w:r>
+            <w:r>
+              <w:rPr>
+                <w:rFonts w:asciiTheme="minorHAnsi" w:hAnsiTheme="minorHAnsi"/>
+                <w:sz w:val="22"/>
+              </w:rPr>
+              <w:br/>
+              <w:t xml:space="preserve">404 - транзакция, </w:t>
+            </w:r>
+            <w:proofErr w:type="spellStart"/>
+            <w:r>
+              <w:rPr>
+                <w:rFonts w:asciiTheme="minorHAnsi" w:hAnsiTheme="minorHAnsi"/>
+                <w:sz w:val="22"/>
+              </w:rPr>
+              <w:t>place_id</w:t>
+            </w:r>
+            <w:proofErr w:type="spellEnd"/>
+            <w:r>
+              <w:rPr>
+                <w:rFonts w:asciiTheme="minorHAnsi" w:hAnsiTheme="minorHAnsi"/>
+                <w:sz w:val="22"/>
+              </w:rPr>
+              <w:t xml:space="preserve"> или </w:t>
+            </w:r>
+            <w:proofErr w:type="spellStart"/>
+            <w:r>
+              <w:rPr>
+                <w:rFonts w:asciiTheme="minorHAnsi" w:hAnsiTheme="minorHAnsi"/>
+                <w:sz w:val="22"/>
+              </w:rPr>
+              <w:t>category_id</w:t>
+            </w:r>
+            <w:proofErr w:type="spellEnd"/>
+            <w:r>
+              <w:rPr>
+                <w:rFonts w:asciiTheme="minorHAnsi" w:hAnsiTheme="minorHAnsi"/>
+                <w:sz w:val="22"/>
+              </w:rPr>
+              <w:t xml:space="preserve"> не </w:t>
+            </w:r>
+            <w:r>
+              <w:rPr>
+                <w:rFonts w:asciiTheme="minorHAnsi" w:hAnsiTheme="minorHAnsi"/>
+                <w:sz w:val="22"/>
+              </w:rPr>
+              <w:lastRenderedPageBreak/>
+              <w:t>найдены</w:t>
+            </w:r>
+            <w:r>
+              <w:rPr>
+                <w:rFonts w:asciiTheme="minorHAnsi" w:hAnsiTheme="minorHAnsi"/>
+                <w:sz w:val="22"/>
+              </w:rPr>
+              <w:br/>
+              <w:t>422 - неверный формат полей</w:t>
+            </w:r>
+            <w:r>
+              <w:rPr>
+                <w:rFonts w:asciiTheme="minorHAnsi" w:hAnsiTheme="minorHAnsi"/>
+                <w:sz w:val="22"/>
+              </w:rPr>
+              <w:br/>
+              <w:t>500 - ошибка сервера</w:t>
+            </w:r>
           </w:p>
         </w:tc>
         <w:tc>
@@ -7592,6 +8359,7 @@
               <w:pStyle w:val="aa"/>
             </w:pPr>
             <w:r>
+              <w:lastRenderedPageBreak/>
               <w:t>Изменить транзакцию</w:t>
             </w:r>
           </w:p>
@@ -7726,13 +8494,67 @@
         <w:tc>
           <w:tcPr>
             <w:tcW w:w="516" w:type="pct"/>
-            <w:noWrap/>
-            <w:hideMark/>
-          </w:tcPr>
-          <w:p>
-            <w:pPr>
-              <w:pStyle w:val="aa"/>
-            </w:pPr>
+            <w:hideMark/>
+          </w:tcPr>
+          <w:p>
+            <w:pPr>
+              <w:pStyle w:val="aa"/>
+              <w:rPr>
+                <w:rFonts w:asciiTheme="minorHAnsi" w:hAnsiTheme="minorHAnsi"/>
+                <w:sz w:val="22"/>
+              </w:rPr>
+            </w:pPr>
+            <w:r>
+              <w:t>400</w:t>
+            </w:r>
+            <w:r>
+              <w:rPr>
+                <w:rFonts w:asciiTheme="minorHAnsi" w:hAnsiTheme="minorHAnsi"/>
+                <w:sz w:val="22"/>
+              </w:rPr>
+              <w:t xml:space="preserve"> - неверный </w:t>
+            </w:r>
+            <w:proofErr w:type="spellStart"/>
+            <w:r>
+              <w:rPr>
+                <w:rFonts w:asciiTheme="minorHAnsi" w:hAnsiTheme="minorHAnsi"/>
+                <w:sz w:val="22"/>
+              </w:rPr>
+              <w:t>transaction_type</w:t>
+            </w:r>
+            <w:proofErr w:type="spellEnd"/>
+            <w:r>
+              <w:rPr>
+                <w:rFonts w:asciiTheme="minorHAnsi" w:hAnsiTheme="minorHAnsi"/>
+                <w:sz w:val="22"/>
+              </w:rPr>
+              <w:br/>
+              <w:t>401 - нет токена авторизации</w:t>
+            </w:r>
+            <w:r>
+              <w:rPr>
+                <w:rFonts w:asciiTheme="minorHAnsi" w:hAnsiTheme="minorHAnsi"/>
+                <w:sz w:val="22"/>
+              </w:rPr>
+              <w:br/>
+              <w:t>403 - попытка удалить чужую транзакцию</w:t>
+            </w:r>
+            <w:r>
+              <w:rPr>
+                <w:rFonts w:asciiTheme="minorHAnsi" w:hAnsiTheme="minorHAnsi"/>
+                <w:sz w:val="22"/>
+              </w:rPr>
+              <w:br/>
+              <w:t>404 - транзакция не найдена</w:t>
+            </w:r>
+            <w:r>
+              <w:rPr>
+                <w:rFonts w:asciiTheme="minorHAnsi" w:hAnsiTheme="minorHAnsi"/>
+                <w:sz w:val="22"/>
+              </w:rPr>
+              <w:br/>
+              <w:t>500 - ошибка сервера</w:t>
+            </w:r>
           </w:p>
         </w:tc>
         <w:tc>
@@ -7976,16 +8798,59 @@
         <w:tc>
           <w:tcPr>
             <w:tcW w:w="516" w:type="pct"/>
-            <w:noWrap/>
-            <w:hideMark/>
-          </w:tcPr>
-          <w:p>
-            <w:pPr>
-              <w:pStyle w:val="aa"/>
-              <w:rPr>
-                <w:lang w:val="en-US"/>
-              </w:rPr>
-            </w:pPr>
+            <w:hideMark/>
+          </w:tcPr>
+          <w:p>
+            <w:pPr>
+              <w:pStyle w:val="aa"/>
+              <w:rPr>
+                <w:rFonts w:asciiTheme="minorHAnsi" w:hAnsiTheme="minorHAnsi"/>
+                <w:sz w:val="22"/>
+              </w:rPr>
+            </w:pPr>
+            <w:r>
+              <w:t>400</w:t>
+            </w:r>
+            <w:r>
+              <w:rPr>
+                <w:rFonts w:asciiTheme="minorHAnsi" w:hAnsiTheme="minorHAnsi"/>
+                <w:sz w:val="22"/>
+              </w:rPr>
+              <w:t xml:space="preserve"> - неверный </w:t>
+            </w:r>
+            <w:proofErr w:type="spellStart"/>
+            <w:r>
+              <w:rPr>
+                <w:rFonts w:asciiTheme="minorHAnsi" w:hAnsiTheme="minorHAnsi"/>
+                <w:sz w:val="22"/>
+              </w:rPr>
+              <w:t>transaction_type</w:t>
+            </w:r>
+            <w:proofErr w:type="spellEnd"/>
+            <w:r>
+              <w:rPr>
+                <w:rFonts w:asciiTheme="minorHAnsi" w:hAnsiTheme="minorHAnsi"/>
+                <w:sz w:val="22"/>
+              </w:rPr>
+              <w:br/>
+              <w:t>401 - нет токена авторизации</w:t>
+            </w:r>
+            <w:r>
+              <w:rPr>
+                <w:rFonts w:asciiTheme="minorHAnsi" w:hAnsiTheme="minorHAnsi"/>
+                <w:sz w:val="22"/>
+              </w:rPr>
+              <w:br/>
+              <w:t>403 - попытка получить чужие категории</w:t>
+            </w:r>
+            <w:r>
+              <w:rPr>
+                <w:rFonts w:asciiTheme="minorHAnsi" w:hAnsiTheme="minorHAnsi"/>
+                <w:sz w:val="22"/>
+              </w:rPr>
+              <w:br/>
+              <w:t>500 - ошибка сервера</w:t>
+            </w:r>
           </w:p>
         </w:tc>
         <w:tc>
@@ -8018,6 +8883,7 @@
               <w:pStyle w:val="aa"/>
             </w:pPr>
             <w:r>
+              <w:lastRenderedPageBreak/>
               <w:t>12</w:t>
             </w:r>
           </w:p>
@@ -8138,13 +9004,50 @@
         <w:tc>
           <w:tcPr>
             <w:tcW w:w="516" w:type="pct"/>
-            <w:noWrap/>
-            <w:hideMark/>
-          </w:tcPr>
-          <w:p>
-            <w:pPr>
-              <w:pStyle w:val="aa"/>
-            </w:pPr>
+            <w:hideMark/>
+          </w:tcPr>
+          <w:p>
+            <w:pPr>
+              <w:pStyle w:val="aa"/>
+              <w:rPr>
+                <w:rFonts w:asciiTheme="minorHAnsi" w:hAnsiTheme="minorHAnsi"/>
+                <w:sz w:val="22"/>
+              </w:rPr>
+            </w:pPr>
+            <w:r>
+              <w:t>401</w:t>
+            </w:r>
+            <w:r>
+              <w:rPr>
+                <w:rFonts w:asciiTheme="minorHAnsi" w:hAnsiTheme="minorHAnsi"/>
+                <w:sz w:val="22"/>
+              </w:rPr>
+              <w:t xml:space="preserve"> - нет токена авторизации</w:t>
+            </w:r>
+            <w:r>
+              <w:rPr>
+                <w:rFonts w:asciiTheme="minorHAnsi" w:hAnsiTheme="minorHAnsi"/>
+                <w:sz w:val="22"/>
+              </w:rPr>
+              <w:br/>
+              <w:t>403 - попытка создать категорию для другого пользователя</w:t>
+            </w:r>
+            <w:r>
+              <w:rPr>
+                <w:rFonts w:asciiTheme="minorHAnsi" w:hAnsiTheme="minorHAnsi"/>
+                <w:sz w:val="22"/>
+              </w:rPr>
+              <w:br/>
+              <w:t>422 - пропущены обязательные поля</w:t>
+            </w:r>
+            <w:r>
+              <w:rPr>
+                <w:rFonts w:asciiTheme="minorHAnsi" w:hAnsiTheme="minorHAnsi"/>
+                <w:sz w:val="22"/>
+              </w:rPr>
+              <w:br/>
+              <w:t>500 - ошибка сервера</w:t>
+            </w:r>
           </w:p>
         </w:tc>
         <w:tc>
@@ -8313,13 +9216,59 @@
         <w:tc>
           <w:tcPr>
             <w:tcW w:w="516" w:type="pct"/>
-            <w:noWrap/>
-            <w:hideMark/>
-          </w:tcPr>
-          <w:p>
-            <w:pPr>
-              <w:pStyle w:val="aa"/>
-            </w:pPr>
+            <w:hideMark/>
+          </w:tcPr>
+          <w:p>
+            <w:pPr>
+              <w:pStyle w:val="aa"/>
+              <w:rPr>
+                <w:rFonts w:asciiTheme="minorHAnsi" w:hAnsiTheme="minorHAnsi"/>
+                <w:sz w:val="22"/>
+              </w:rPr>
+            </w:pPr>
+            <w:r>
+              <w:t>401</w:t>
+            </w:r>
+            <w:r>
+              <w:rPr>
+                <w:rFonts w:asciiTheme="minorHAnsi" w:hAnsiTheme="minorHAnsi"/>
+                <w:sz w:val="22"/>
+              </w:rPr>
+              <w:t xml:space="preserve"> - нет токена авторизации</w:t>
+            </w:r>
+            <w:r>
+              <w:rPr>
+                <w:rFonts w:asciiTheme="minorHAnsi" w:hAnsiTheme="minorHAnsi"/>
+                <w:sz w:val="22"/>
+              </w:rPr>
+              <w:br/>
+              <w:t>403 - попытка создать категорию для другого пользователя</w:t>
+            </w:r>
+            <w:r>
+              <w:rPr>
+                <w:rFonts w:asciiTheme="minorHAnsi" w:hAnsiTheme="minorHAnsi"/>
+                <w:sz w:val="22"/>
+              </w:rPr>
+              <w:br/>
+              <w:t xml:space="preserve">422 - пропущены обязательные поля или неверный формат </w:t>
+            </w:r>
+            <w:proofErr w:type="spellStart"/>
+            <w:r>
+              <w:rPr>
+                <w:rFonts w:asciiTheme="minorHAnsi" w:hAnsiTheme="minorHAnsi"/>
+                <w:sz w:val="22"/>
+              </w:rPr>
+              <w:t>limit</w:t>
+            </w:r>
+            <w:proofErr w:type="spellEnd"/>
+            <w:r>
+              <w:rPr>
+                <w:rFonts w:asciiTheme="minorHAnsi" w:hAnsiTheme="minorHAnsi"/>
+                <w:sz w:val="22"/>
+              </w:rPr>
+              <w:br/>
+              <w:t>500 - ошибка сервера</w:t>
+            </w:r>
           </w:p>
         </w:tc>
         <w:tc>
@@ -8352,7 +9301,6 @@
               <w:pStyle w:val="aa"/>
             </w:pPr>
             <w:r>
-              <w:lastRenderedPageBreak/>
               <w:t>14</w:t>
             </w:r>
           </w:p>
@@ -8484,13 +9432,66 @@
         <w:tc>
           <w:tcPr>
             <w:tcW w:w="516" w:type="pct"/>
-            <w:noWrap/>
-            <w:hideMark/>
-          </w:tcPr>
-          <w:p>
-            <w:pPr>
-              <w:pStyle w:val="aa"/>
-            </w:pPr>
+            <w:hideMark/>
+          </w:tcPr>
+          <w:p>
+            <w:pPr>
+              <w:pStyle w:val="aa"/>
+              <w:rPr>
+                <w:rFonts w:asciiTheme="minorHAnsi" w:hAnsiTheme="minorHAnsi"/>
+                <w:sz w:val="22"/>
+              </w:rPr>
+            </w:pPr>
+            <w:r>
+              <w:t>401</w:t>
+            </w:r>
+            <w:r>
+              <w:rPr>
+                <w:rFonts w:asciiTheme="minorHAnsi" w:hAnsiTheme="minorHAnsi"/>
+                <w:sz w:val="22"/>
+              </w:rPr>
+              <w:t xml:space="preserve"> - нет токена авторизации</w:t>
+            </w:r>
+            <w:r>
+              <w:rPr>
+                <w:rFonts w:asciiTheme="minorHAnsi" w:hAnsiTheme="minorHAnsi"/>
+                <w:sz w:val="22"/>
+              </w:rPr>
+              <w:br/>
+              <w:t xml:space="preserve">403 - попытка </w:t>
+            </w:r>
+            <w:r>
+              <w:rPr>
+                <w:rFonts w:asciiTheme="minorHAnsi" w:hAnsiTheme="minorHAnsi"/>
+                <w:sz w:val="22"/>
+              </w:rPr>
+              <w:lastRenderedPageBreak/>
+              <w:t>изменить чужую категорию</w:t>
+            </w:r>
+            <w:r>
+              <w:rPr>
+                <w:rFonts w:asciiTheme="minorHAnsi" w:hAnsiTheme="minorHAnsi"/>
+                <w:sz w:val="22"/>
+              </w:rPr>
+              <w:br/>
+              <w:t>404 - категория не найдена</w:t>
+            </w:r>
+            <w:r>
+              <w:rPr>
+                <w:rFonts w:asciiTheme="minorHAnsi" w:hAnsiTheme="minorHAnsi"/>
+                <w:sz w:val="22"/>
+              </w:rPr>
+              <w:br/>
+              <w:t>422 - неверный формат полей</w:t>
+            </w:r>
+            <w:r>
+              <w:rPr>
+                <w:rFonts w:asciiTheme="minorHAnsi" w:hAnsiTheme="minorHAnsi"/>
+                <w:sz w:val="22"/>
+              </w:rPr>
+              <w:br/>
+              <w:t>500 - ошибка сервера</w:t>
+            </w:r>
           </w:p>
         </w:tc>
         <w:tc>
@@ -8503,7 +9504,12 @@
               <w:pStyle w:val="aa"/>
             </w:pPr>
             <w:r>
-              <w:t>Изменить информацию о категории доходов</w:t>
+              <w:lastRenderedPageBreak/>
+              <w:t>Изменить информацию о катег</w:t>
+            </w:r>
+            <w:r>
+              <w:lastRenderedPageBreak/>
+              <w:t>ории доходов</w:t>
             </w:r>
           </w:p>
         </w:tc>
@@ -8523,6 +9529,7 @@
               <w:pStyle w:val="aa"/>
             </w:pPr>
             <w:r>
+              <w:lastRenderedPageBreak/>
               <w:t>15</w:t>
             </w:r>
           </w:p>
@@ -8670,13 +9677,67 @@
         <w:tc>
           <w:tcPr>
             <w:tcW w:w="516" w:type="pct"/>
-            <w:noWrap/>
-            <w:hideMark/>
-          </w:tcPr>
-          <w:p>
-            <w:pPr>
-              <w:pStyle w:val="aa"/>
-            </w:pPr>
+            <w:hideMark/>
+          </w:tcPr>
+          <w:p>
+            <w:pPr>
+              <w:pStyle w:val="aa"/>
+              <w:rPr>
+                <w:rFonts w:asciiTheme="minorHAnsi" w:hAnsiTheme="minorHAnsi"/>
+                <w:sz w:val="22"/>
+              </w:rPr>
+            </w:pPr>
+            <w:r>
+              <w:t>401</w:t>
+            </w:r>
+            <w:r>
+              <w:rPr>
+                <w:rFonts w:asciiTheme="minorHAnsi" w:hAnsiTheme="minorHAnsi"/>
+                <w:sz w:val="22"/>
+              </w:rPr>
+              <w:t xml:space="preserve"> - нет токена авторизации</w:t>
+            </w:r>
+            <w:r>
+              <w:rPr>
+                <w:rFonts w:asciiTheme="minorHAnsi" w:hAnsiTheme="minorHAnsi"/>
+                <w:sz w:val="22"/>
+              </w:rPr>
+              <w:br/>
+              <w:t>403 - попытка изменить чужую категорию</w:t>
+            </w:r>
+            <w:r>
+              <w:rPr>
+                <w:rFonts w:asciiTheme="minorHAnsi" w:hAnsiTheme="minorHAnsi"/>
+                <w:sz w:val="22"/>
+              </w:rPr>
+              <w:br/>
+              <w:t>404 - категория не найдена</w:t>
+            </w:r>
+            <w:r>
+              <w:rPr>
+                <w:rFonts w:asciiTheme="minorHAnsi" w:hAnsiTheme="minorHAnsi"/>
+                <w:sz w:val="22"/>
+              </w:rPr>
+              <w:br/>
+              <w:t xml:space="preserve">422 - неверный формат полей или </w:t>
+            </w:r>
+            <w:proofErr w:type="spellStart"/>
+            <w:r>
+              <w:rPr>
+                <w:rFonts w:asciiTheme="minorHAnsi" w:hAnsiTheme="minorHAnsi"/>
+                <w:sz w:val="22"/>
+              </w:rPr>
+              <w:t>limit</w:t>
+            </w:r>
+            <w:proofErr w:type="spellEnd"/>
+            <w:r>
+              <w:rPr>
+                <w:rFonts w:asciiTheme="minorHAnsi" w:hAnsiTheme="minorHAnsi"/>
+                <w:sz w:val="22"/>
+              </w:rPr>
+              <w:br/>
+              <w:t>500 - ошибка сервера</w:t>
+            </w:r>
           </w:p>
         </w:tc>
         <w:tc>
@@ -8823,13 +9884,83 @@
         <w:tc>
           <w:tcPr>
             <w:tcW w:w="516" w:type="pct"/>
-            <w:noWrap/>
-            <w:hideMark/>
-          </w:tcPr>
-          <w:p>
-            <w:pPr>
-              <w:pStyle w:val="aa"/>
-            </w:pPr>
+            <w:hideMark/>
+          </w:tcPr>
+          <w:p>
+            <w:pPr>
+              <w:pStyle w:val="aa"/>
+              <w:rPr>
+                <w:rFonts w:asciiTheme="minorHAnsi" w:hAnsiTheme="minorHAnsi"/>
+                <w:sz w:val="22"/>
+              </w:rPr>
+            </w:pPr>
+            <w:r>
+              <w:t>400</w:t>
+            </w:r>
+            <w:r>
+              <w:rPr>
+                <w:rFonts w:asciiTheme="minorHAnsi" w:hAnsiTheme="minorHAnsi"/>
+                <w:sz w:val="22"/>
+              </w:rPr>
+              <w:t xml:space="preserve"> - неверный </w:t>
+            </w:r>
+            <w:proofErr w:type="spellStart"/>
+            <w:r>
+              <w:rPr>
+                <w:rFonts w:asciiTheme="minorHAnsi" w:hAnsiTheme="minorHAnsi"/>
+                <w:sz w:val="22"/>
+              </w:rPr>
+              <w:t>transaction_type</w:t>
+            </w:r>
+            <w:proofErr w:type="spellEnd"/>
+            <w:r>
+              <w:rPr>
+                <w:rFonts w:asciiTheme="minorHAnsi" w:hAnsiTheme="minorHAnsi"/>
+                <w:sz w:val="22"/>
+              </w:rPr>
+              <w:br/>
+              <w:t>401 - нет токена авторизации</w:t>
+            </w:r>
+            <w:r>
+              <w:rPr>
+                <w:rFonts w:asciiTheme="minorHAnsi" w:hAnsiTheme="minorHAnsi"/>
+                <w:sz w:val="22"/>
+              </w:rPr>
+              <w:br/>
+              <w:t xml:space="preserve">403 - </w:t>
+            </w:r>
+            <w:r>
+              <w:rPr>
+                <w:rFonts w:asciiTheme="minorHAnsi" w:hAnsiTheme="minorHAnsi"/>
+                <w:sz w:val="22"/>
+              </w:rPr>
+              <w:lastRenderedPageBreak/>
+              <w:t>попытка удалить чужую категорию</w:t>
+            </w:r>
+            <w:r>
+              <w:rPr>
+                <w:rFonts w:asciiTheme="minorHAnsi" w:hAnsiTheme="minorHAnsi"/>
+                <w:sz w:val="22"/>
+              </w:rPr>
+              <w:br/>
+              <w:t>404 - категория не найдена</w:t>
+            </w:r>
+            <w:r>
+              <w:rPr>
+                <w:rFonts w:asciiTheme="minorHAnsi" w:hAnsiTheme="minorHAnsi"/>
+                <w:sz w:val="22"/>
+              </w:rPr>
+              <w:br/>
+              <w:t>409 - к категории привязаны транзакции</w:t>
+            </w:r>
+            <w:r>
+              <w:rPr>
+                <w:rFonts w:asciiTheme="minorHAnsi" w:hAnsiTheme="minorHAnsi"/>
+                <w:sz w:val="22"/>
+              </w:rPr>
+              <w:br/>
+              <w:t>500 - ошибка сервера</w:t>
+            </w:r>
           </w:p>
         </w:tc>
         <w:tc>
@@ -8842,6 +9973,7 @@
               <w:pStyle w:val="aa"/>
             </w:pPr>
             <w:r>
+              <w:lastRenderedPageBreak/>
               <w:t>Удалить категорию</w:t>
             </w:r>
           </w:p>
@@ -8954,7 +10086,7 @@
         </w:rPr>
         <w:lastRenderedPageBreak/>
         <w:drawing>
-          <wp:inline distT="0" distB="0" distL="0" distR="0" wp14:anchorId="1C13013E" wp14:editId="486927F1">
+          <wp:inline distT="0" distB="0" distL="0" distR="0" wp14:anchorId="1C13013E" wp14:editId="608AC546">
             <wp:extent cx="6120130" cy="2832735"/>
             <wp:effectExtent l="0" t="0" r="0" b="5715"/>
             <wp:docPr id="1909926982" name="Рисунок 2"/>
@@ -9005,7 +10137,7 @@
           <w:noProof/>
         </w:rPr>
         <w:drawing>
-          <wp:inline distT="0" distB="0" distL="0" distR="0" wp14:anchorId="432EEFCD" wp14:editId="434BA797">
+          <wp:inline distT="0" distB="0" distL="0" distR="0" wp14:anchorId="432EEFCD" wp14:editId="3AF83EB7">
             <wp:extent cx="6120130" cy="3556635"/>
             <wp:effectExtent l="0" t="0" r="0" b="5715"/>
             <wp:docPr id="619732501" name="Рисунок 3"/>
@@ -9056,7 +10188,7 @@
           <w:noProof/>
         </w:rPr>
         <w:drawing>
-          <wp:inline distT="0" distB="0" distL="0" distR="0" wp14:anchorId="3F0E803D" wp14:editId="693F7A81">
+          <wp:inline distT="0" distB="0" distL="0" distR="0" wp14:anchorId="3F0E803D" wp14:editId="1AB20861">
             <wp:extent cx="6120130" cy="1485900"/>
             <wp:effectExtent l="0" t="0" r="0" b="0"/>
             <wp:docPr id="1894483415" name="Рисунок 4"/>
@@ -9113,7 +10245,7 @@
         </w:rPr>
         <w:lastRenderedPageBreak/>
         <w:drawing>
-          <wp:inline distT="0" distB="0" distL="0" distR="0" wp14:anchorId="5210D9CA" wp14:editId="21738EF1">
+          <wp:inline distT="0" distB="0" distL="0" distR="0" wp14:anchorId="5210D9CA" wp14:editId="365FF7CB">
             <wp:extent cx="6120130" cy="2541905"/>
             <wp:effectExtent l="0" t="0" r="0" b="0"/>
             <wp:docPr id="1540790526" name="Рисунок 5"/>
@@ -9164,7 +10296,7 @@
           <w:noProof/>
         </w:rPr>
         <w:drawing>
-          <wp:inline distT="0" distB="0" distL="0" distR="0" wp14:anchorId="781AF619" wp14:editId="79BB4C85">
+          <wp:inline distT="0" distB="0" distL="0" distR="0" wp14:anchorId="781AF619" wp14:editId="7596D46B">
             <wp:extent cx="6120130" cy="1805940"/>
             <wp:effectExtent l="0" t="0" r="0" b="3810"/>
             <wp:docPr id="1989431065" name="Рисунок 6"/>
@@ -9220,7 +10352,7 @@
           <w:noProof/>
         </w:rPr>
         <w:drawing>
-          <wp:inline distT="0" distB="0" distL="0" distR="0" wp14:anchorId="3E69EE25" wp14:editId="5249F14F">
+          <wp:inline distT="0" distB="0" distL="0" distR="0" wp14:anchorId="3E69EE25" wp14:editId="7F54DC5D">
             <wp:extent cx="6120130" cy="2717800"/>
             <wp:effectExtent l="0" t="0" r="0" b="6350"/>
             <wp:docPr id="218499688" name="Рисунок 7"/>
@@ -9277,7 +10409,7 @@
         </w:rPr>
         <w:lastRenderedPageBreak/>
         <w:drawing>
-          <wp:inline distT="0" distB="0" distL="0" distR="0" wp14:anchorId="72E59EBE" wp14:editId="71A7ED5D">
+          <wp:inline distT="0" distB="0" distL="0" distR="0" wp14:anchorId="72E59EBE" wp14:editId="3A0F7DAB">
             <wp:extent cx="6120130" cy="3260725"/>
             <wp:effectExtent l="0" t="0" r="0" b="0"/>
             <wp:docPr id="2005082096" name="Рисунок 8"/>
@@ -12117,7 +13249,6 @@
   <w:style w:type="character" w:default="1" w:styleId="a0">
     <w:name w:val="Default Paragraph Font"/>
     <w:uiPriority w:val="1"/>
-    <w:semiHidden/>
     <w:unhideWhenUsed/>
   </w:style>
   <w:style w:type="table" w:default="1" w:styleId="a1">

</xml_diff>